<commit_message>
structure and doc updates
</commit_message>
<xml_diff>
--- a/Final Project Test Plan.docx
+++ b/Final Project Test Plan.docx
@@ -2474,6 +2474,7 @@
       <w:r>
         <w:rPr>
           <w:rFonts w:ascii="Times New Roman" w:eastAsia="Times New Roman" w:hAnsi="Times New Roman" w:cs="Times New Roman"/>
+          <w:noProof/>
           <w:color w:val="auto"/>
           <w:kern w:val="0"/>
           <w:sz w:val="24"/>
@@ -3323,6 +3324,19 @@
     </w:p>
     <w:p>
       <w:pPr>
+        <w:rPr>
+          <w:lang w:val="en-GB"/>
+        </w:rPr>
+      </w:pPr>
+      <w:r>
+        <w:rPr>
+          <w:lang w:val="en-GB"/>
+        </w:rPr>
+        <w:t>Successfully set up a very early automated test to check the title of the homepage.</w:t>
+      </w:r>
+    </w:p>
+    <w:p>
+      <w:pPr>
         <w:pStyle w:val="Heading2"/>
         <w:rPr>
           <w:lang w:val="en-GB"/>
@@ -3531,7 +3545,38 @@
         <w:rPr>
           <w:lang w:val="en-GB"/>
         </w:rPr>
-        <w:t>, I did a “pre-test” phase before I even knew anything about the project. This involved putting together some fundamentals of a generic test plan, with headings such as “Static Testing”, “Test Techniques”, “Exploratory Testing”, “Automation”, “Non-Functional Testing”, “Findings” and “Conclusion”</w:t>
+        <w:t xml:space="preserve">, </w:t>
+      </w:r>
+      <w:r>
+        <w:rPr>
+          <w:lang w:val="en-GB"/>
+        </w:rPr>
+        <w:t>we</w:t>
+      </w:r>
+      <w:r>
+        <w:rPr>
+          <w:lang w:val="en-GB"/>
+        </w:rPr>
+        <w:t xml:space="preserve"> did a “pre-test” phase before </w:t>
+      </w:r>
+      <w:r>
+        <w:rPr>
+          <w:lang w:val="en-GB"/>
+        </w:rPr>
+        <w:t>we</w:t>
+      </w:r>
+      <w:r>
+        <w:rPr>
+          <w:lang w:val="en-GB"/>
+        </w:rPr>
+        <w:t xml:space="preserve"> even knew anything about the project. This involved putting together some fundamentals of a generic test plan, with headings such as “Static Testing”, “Test Techniques”, “Exploratory Testing”, </w:t>
+      </w:r>
+      <w:r>
+        <w:rPr>
+          <w:lang w:val="en-GB"/>
+        </w:rPr>
+        <w:lastRenderedPageBreak/>
+        <w:t>“Automation”, “Non-Functional Testing”, “Findings” and “Conclusion”</w:t>
       </w:r>
       <w:r>
         <w:rPr>
@@ -3556,8 +3601,13 @@
         <w:rPr>
           <w:lang w:val="en-GB"/>
         </w:rPr>
-        <w:lastRenderedPageBreak/>
-        <w:t xml:space="preserve">I also prepared a generic Selenium framework based on code from previous projects, which would come in handy should </w:t>
+        <w:t>We</w:t>
+      </w:r>
+      <w:r>
+        <w:rPr>
+          <w:lang w:val="en-GB"/>
+        </w:rPr>
+        <w:t xml:space="preserve"> also prepared a generic Selenium framework based on code from previous projects, which would come in handy should </w:t>
       </w:r>
       <w:r>
         <w:rPr>

</xml_diff>